<commit_message>
updates w 2025 work and resume
</commit_message>
<xml_diff>
--- a/Ben_Chartoff_Resume.docx
+++ b/Ben_Chartoff_Resume.docx
@@ -30,7 +30,7 @@
         <w:rPr>
           <w:rStyle w:val="NameChar"/>
           <w:rFonts w:ascii="Arial" w:hAnsi="Arial" w:cs="Arial"/>
-          <w:color w:val="1696D3"/>
+          <w:color w:val="1F3864" w:themeColor="accent1" w:themeShade="80"/>
         </w:rPr>
         <w:t>Ben Chartoff</w:t>
       </w:r>
@@ -122,13 +122,13 @@
         <w:pStyle w:val="SectionHeader"/>
         <w:rPr>
           <w:rFonts w:ascii="Arial" w:hAnsi="Arial" w:cs="Arial"/>
-          <w:color w:val="1696D3"/>
-        </w:rPr>
-      </w:pPr>
-      <w:r>
-        <w:rPr>
-          <w:rFonts w:ascii="Arial" w:hAnsi="Arial" w:cs="Arial"/>
-          <w:color w:val="1696D3"/>
+          <w:color w:val="1F3864" w:themeColor="accent1" w:themeShade="80"/>
+        </w:rPr>
+      </w:pPr>
+      <w:r>
+        <w:rPr>
+          <w:rFonts w:ascii="Arial" w:hAnsi="Arial" w:cs="Arial"/>
+          <w:color w:val="1F3864" w:themeColor="accent1" w:themeShade="80"/>
         </w:rPr>
         <w:t>CONTACT</w:t>
       </w:r>
@@ -196,13 +196,13 @@
         <w:pStyle w:val="SectionHeader"/>
         <w:rPr>
           <w:rFonts w:ascii="Arial" w:hAnsi="Arial" w:cs="Arial"/>
-          <w:color w:val="1696D3"/>
-        </w:rPr>
-      </w:pPr>
-      <w:r>
-        <w:rPr>
-          <w:rFonts w:ascii="Arial" w:hAnsi="Arial" w:cs="Arial"/>
-          <w:color w:val="1696D3"/>
+          <w:color w:val="1F3864" w:themeColor="accent1" w:themeShade="80"/>
+        </w:rPr>
+      </w:pPr>
+      <w:r>
+        <w:rPr>
+          <w:rFonts w:ascii="Arial" w:hAnsi="Arial" w:cs="Arial"/>
+          <w:color w:val="1F3864" w:themeColor="accent1" w:themeShade="80"/>
         </w:rPr>
         <w:t>EDUCATION</w:t>
       </w:r>
@@ -271,15 +271,6 @@
     </w:p>
     <w:p>
       <w:pPr>
-        <w:rPr>
-          <w:rFonts w:ascii="Arial" w:eastAsia="Mulish" w:hAnsi="Arial" w:cs="Arial"/>
-          <w:sz w:val="18"/>
-          <w:szCs w:val="18"/>
-        </w:rPr>
-      </w:pPr>
-    </w:p>
-    <w:p>
-      <w:pPr>
         <w:spacing w:after="120"/>
         <w:rPr>
           <w:rFonts w:ascii="Arial" w:eastAsia="Mulish" w:hAnsi="Arial" w:cs="Arial"/>
@@ -287,6 +278,16 @@
           <w:szCs w:val="18"/>
         </w:rPr>
       </w:pPr>
+    </w:p>
+    <w:p>
+      <w:pPr>
+        <w:spacing w:after="120"/>
+        <w:rPr>
+          <w:rFonts w:ascii="Arial" w:eastAsia="Mulish" w:hAnsi="Arial" w:cs="Arial"/>
+          <w:sz w:val="18"/>
+          <w:szCs w:val="18"/>
+        </w:rPr>
+      </w:pPr>
       <w:r>
         <w:rPr>
           <w:rFonts w:ascii="Arial" w:eastAsia="Mulish" w:hAnsi="Arial" w:cs="Arial"/>
@@ -379,20 +380,20 @@
         <w:pStyle w:val="SectionHeader"/>
         <w:rPr>
           <w:rFonts w:ascii="Arial" w:hAnsi="Arial" w:cs="Arial"/>
-          <w:color w:val="1696D3"/>
-        </w:rPr>
-      </w:pPr>
-      <w:r>
-        <w:rPr>
-          <w:rFonts w:ascii="Arial" w:hAnsi="Arial" w:cs="Arial"/>
-          <w:color w:val="1696D3"/>
+          <w:color w:val="1F3864" w:themeColor="accent1" w:themeShade="80"/>
+        </w:rPr>
+      </w:pPr>
+      <w:r>
+        <w:rPr>
+          <w:rFonts w:ascii="Arial" w:hAnsi="Arial" w:cs="Arial"/>
+          <w:color w:val="1F3864" w:themeColor="accent1" w:themeShade="80"/>
         </w:rPr>
         <w:t>SKILLS</w:t>
       </w:r>
     </w:p>
     <w:p>
       <w:pPr>
-        <w:spacing w:after="360"/>
+        <w:spacing w:after="360" w:line="360" w:lineRule="auto"/>
         <w:rPr>
           <w:rFonts w:ascii="Arial" w:eastAsia="Mulish" w:hAnsi="Arial" w:cs="Arial"/>
           <w:color w:val="434343"/>
@@ -407,7 +408,7 @@
           <w:sz w:val="18"/>
           <w:szCs w:val="18"/>
         </w:rPr>
-        <w:t>Data Visualization, Data analysis, Data Visualization Design, Power BI, Web Development, D3.js</w:t>
+        <w:t xml:space="preserve">Proficient in </w:t>
       </w:r>
       <w:r>
         <w:rPr>
@@ -416,13 +417,62 @@
           <w:sz w:val="18"/>
           <w:szCs w:val="18"/>
         </w:rPr>
+        <w:t>Data Visualization, Data analysis, Data Visualization Design, Power BI, Web Development, D3.j</w:t>
+      </w:r>
+      <w:r>
+        <w:rPr>
+          <w:rFonts w:ascii="Arial" w:eastAsia="Mulish" w:hAnsi="Arial" w:cs="Arial"/>
+          <w:color w:val="434343"/>
+          <w:sz w:val="18"/>
+          <w:szCs w:val="18"/>
+        </w:rPr>
+        <w:t>s.</w:t>
+      </w:r>
+    </w:p>
+    <w:p>
+      <w:pPr>
+        <w:spacing w:after="360" w:line="360" w:lineRule="auto"/>
+        <w:rPr>
+          <w:rFonts w:ascii="Arial" w:eastAsia="Mulish" w:hAnsi="Arial" w:cs="Arial"/>
+          <w:color w:val="434343"/>
+          <w:sz w:val="18"/>
+          <w:szCs w:val="18"/>
+        </w:rPr>
+      </w:pPr>
+      <w:r>
+        <w:rPr>
+          <w:rFonts w:ascii="Arial" w:eastAsia="Mulish" w:hAnsi="Arial" w:cs="Arial"/>
+          <w:color w:val="434343"/>
+          <w:sz w:val="18"/>
+          <w:szCs w:val="18"/>
+        </w:rPr>
+        <w:t>Experience with Python, R, Node.js, Databricks, Fabric, React.js, git, Adobe Creative Suite, Figma, Geospatial visualizations.</w:t>
+      </w:r>
+    </w:p>
+    <w:p>
+      <w:pPr>
+        <w:spacing w:after="360" w:line="360" w:lineRule="auto"/>
+        <w:rPr>
+          <w:rFonts w:ascii="Arial" w:eastAsia="Mulish" w:hAnsi="Arial" w:cs="Arial"/>
+          <w:color w:val="1F3864" w:themeColor="accent1" w:themeShade="80"/>
+          <w:sz w:val="18"/>
+          <w:szCs w:val="18"/>
+        </w:rPr>
+      </w:pPr>
+      <w:r>
+        <w:rPr>
+          <w:rFonts w:ascii="Arial" w:eastAsia="Mulish" w:hAnsi="Arial" w:cs="Arial"/>
+          <w:color w:val="434343"/>
+          <w:sz w:val="18"/>
+          <w:szCs w:val="18"/>
+        </w:rPr>
         <w:br w:type="column"/>
       </w:r>
       <w:r>
         <w:rPr>
           <w:rStyle w:val="SectionHeaderChar"/>
           <w:rFonts w:ascii="Arial" w:hAnsi="Arial" w:cs="Arial"/>
-          <w:color w:val="1696D3"/>
+          <w:color w:val="1F3864" w:themeColor="accent1" w:themeShade="80"/>
         </w:rPr>
         <w:t>WORK EXPERIENCE</w:t>
       </w:r>
@@ -430,6 +480,7 @@
     <w:p>
       <w:pPr>
         <w:pStyle w:val="Company"/>
+        <w:spacing w:line="360" w:lineRule="auto"/>
         <w:rPr>
           <w:rFonts w:ascii="Arial" w:hAnsi="Arial" w:cs="Arial"/>
         </w:rPr>
@@ -464,7 +515,7 @@
         <w:rPr>
           <w:rFonts w:ascii="Arial" w:hAnsi="Arial" w:cs="Arial"/>
         </w:rPr>
-        <w:t>Current</w:t>
+        <w:t>Present</w:t>
       </w:r>
       <w:r>
         <w:rPr>
@@ -481,7 +532,7 @@
     </w:p>
     <w:p>
       <w:pPr>
-        <w:spacing w:after="120"/>
+        <w:spacing w:after="120" w:line="360" w:lineRule="auto"/>
         <w:rPr>
           <w:rFonts w:ascii="Arial" w:eastAsia="Mulish" w:hAnsi="Arial" w:cs="Arial"/>
           <w:sz w:val="18"/>
@@ -500,15 +551,49 @@
     <w:p>
       <w:pPr>
         <w:pStyle w:val="BulletPoints"/>
-        <w:rPr>
-          <w:rFonts w:ascii="Arial" w:hAnsi="Arial" w:cs="Arial"/>
-        </w:rPr>
-      </w:pPr>
-      <w:r>
-        <w:rPr>
-          <w:rFonts w:ascii="Arial" w:hAnsi="Arial" w:cs="Arial"/>
-        </w:rPr>
-        <w:t xml:space="preserve">Currently serving as Excella team lead within </w:t>
+        <w:spacing w:line="360" w:lineRule="auto"/>
+        <w:rPr>
+          <w:rFonts w:ascii="Arial" w:hAnsi="Arial" w:cs="Arial"/>
+        </w:rPr>
+      </w:pPr>
+      <w:r>
+        <w:rPr>
+          <w:rFonts w:ascii="Arial" w:hAnsi="Arial" w:cs="Arial"/>
+        </w:rPr>
+        <w:t>Summer 2025, building data-driven microsite for private client using React/Next.js and D3.js.</w:t>
+      </w:r>
+    </w:p>
+    <w:p>
+      <w:pPr>
+        <w:pStyle w:val="BulletPoints"/>
+        <w:spacing w:line="360" w:lineRule="auto"/>
+        <w:rPr>
+          <w:rFonts w:ascii="Arial" w:hAnsi="Arial" w:cs="Arial"/>
+        </w:rPr>
+      </w:pPr>
+      <w:r>
+        <w:rPr>
+          <w:rFonts w:ascii="Arial" w:hAnsi="Arial" w:cs="Arial"/>
+        </w:rPr>
+        <w:t>Winter 2024-Spring 2025, served</w:t>
+      </w:r>
+      <w:r>
+        <w:rPr>
+          <w:rFonts w:ascii="Arial" w:hAnsi="Arial" w:cs="Arial"/>
+        </w:rPr>
+        <w:t xml:space="preserve"> as </w:t>
+      </w:r>
+      <w:r>
+        <w:rPr>
+          <w:rFonts w:ascii="Arial" w:hAnsi="Arial" w:cs="Arial"/>
+        </w:rPr>
+        <w:t xml:space="preserve">an </w:t>
+      </w:r>
+      <w:r>
+        <w:rPr>
+          <w:rFonts w:ascii="Arial" w:hAnsi="Arial" w:cs="Arial"/>
+        </w:rPr>
+        <w:t xml:space="preserve">Excella team lead within </w:t>
       </w:r>
       <w:r>
         <w:rPr>
@@ -538,15 +623,28 @@
     <w:p>
       <w:pPr>
         <w:pStyle w:val="BulletPoints"/>
-        <w:rPr>
-          <w:rFonts w:ascii="Arial" w:hAnsi="Arial" w:cs="Arial"/>
-        </w:rPr>
-      </w:pPr>
-      <w:r>
-        <w:rPr>
-          <w:rFonts w:ascii="Arial" w:hAnsi="Arial" w:cs="Arial"/>
-        </w:rPr>
-        <w:t xml:space="preserve">At OPM, led team of Excella developers and BAs, and served as lead developer for the report on federal attrition in the office of </w:t>
+        <w:spacing w:line="360" w:lineRule="auto"/>
+        <w:rPr>
+          <w:rFonts w:ascii="Arial" w:hAnsi="Arial" w:cs="Arial"/>
+        </w:rPr>
+      </w:pPr>
+      <w:r>
+        <w:rPr>
+          <w:rFonts w:ascii="Arial" w:hAnsi="Arial" w:cs="Arial"/>
+        </w:rPr>
+        <w:t>At OPM, led team of Excella developers and BAs, and served as lead developer for</w:t>
+      </w:r>
+      <w:r>
+        <w:rPr>
+          <w:rFonts w:ascii="Arial" w:hAnsi="Arial" w:cs="Arial"/>
+        </w:rPr>
+        <w:t>:</w:t>
+      </w:r>
+      <w:r>
+        <w:rPr>
+          <w:rFonts w:ascii="Arial" w:hAnsi="Arial" w:cs="Arial"/>
+        </w:rPr>
+        <w:t xml:space="preserve"> the report on federal attrition in the office of </w:t>
       </w:r>
       <w:r>
         <w:rPr>
@@ -558,12 +656,19 @@
         <w:rPr>
           <w:rFonts w:ascii="Arial" w:hAnsi="Arial" w:cs="Arial"/>
         </w:rPr>
-        <w:t xml:space="preserve"> (HCDMM).</w:t>
+        <w:t xml:space="preserve"> (HCDM</w:t>
+      </w:r>
+      <w:r>
+        <w:rPr>
+          <w:rFonts w:ascii="Arial" w:hAnsi="Arial" w:cs="Arial"/>
+        </w:rPr>
+        <w:t>M), a suite of internal financial reports for HRS, and a variety of smaller projects.</w:t>
       </w:r>
     </w:p>
     <w:p>
       <w:pPr>
         <w:pStyle w:val="BulletPoints"/>
+        <w:spacing w:line="360" w:lineRule="auto"/>
         <w:rPr>
           <w:rFonts w:ascii="Arial" w:hAnsi="Arial" w:cs="Arial"/>
         </w:rPr>
@@ -589,7 +694,7 @@
     </w:p>
     <w:p>
       <w:pPr>
-        <w:spacing w:after="120"/>
+        <w:spacing w:after="120" w:line="360" w:lineRule="auto"/>
         <w:rPr>
           <w:rFonts w:ascii="Arial" w:eastAsia="Mulish" w:hAnsi="Arial" w:cs="Arial"/>
           <w:i/>
@@ -655,7 +760,7 @@
     </w:p>
     <w:p>
       <w:pPr>
-        <w:spacing w:after="120"/>
+        <w:spacing w:after="120" w:line="360" w:lineRule="auto"/>
         <w:rPr>
           <w:rFonts w:ascii="Arial" w:eastAsia="Mulish" w:hAnsi="Arial" w:cs="Arial"/>
           <w:sz w:val="18"/>
@@ -722,6 +827,7 @@
     <w:p>
       <w:pPr>
         <w:pStyle w:val="BulletPoints"/>
+        <w:spacing w:line="360" w:lineRule="auto"/>
         <w:rPr>
           <w:rFonts w:ascii="Arial" w:hAnsi="Arial" w:cs="Arial"/>
         </w:rPr>
@@ -736,6 +842,7 @@
     <w:p>
       <w:pPr>
         <w:pStyle w:val="BulletPoints"/>
+        <w:spacing w:line="360" w:lineRule="auto"/>
         <w:rPr>
           <w:rFonts w:ascii="Arial" w:hAnsi="Arial" w:cs="Arial"/>
         </w:rPr>
@@ -750,6 +857,7 @@
     <w:p>
       <w:pPr>
         <w:pStyle w:val="BulletPoints"/>
+        <w:spacing w:line="360" w:lineRule="auto"/>
         <w:rPr>
           <w:rFonts w:ascii="Arial" w:hAnsi="Arial" w:cs="Arial"/>
         </w:rPr>
@@ -793,13 +901,13 @@
         <w:pStyle w:val="SectionHeader"/>
         <w:rPr>
           <w:rFonts w:ascii="Arial" w:hAnsi="Arial" w:cs="Arial"/>
-          <w:color w:val="1696D3"/>
-        </w:rPr>
-      </w:pPr>
-      <w:r>
-        <w:rPr>
-          <w:rFonts w:ascii="Arial" w:hAnsi="Arial" w:cs="Arial"/>
-          <w:color w:val="1696D3"/>
+          <w:color w:val="1F3864" w:themeColor="accent1" w:themeShade="80"/>
+        </w:rPr>
+      </w:pPr>
+      <w:r>
+        <w:rPr>
+          <w:rFonts w:ascii="Arial" w:hAnsi="Arial" w:cs="Arial"/>
+          <w:color w:val="1F3864" w:themeColor="accent1" w:themeShade="80"/>
         </w:rPr>
         <w:lastRenderedPageBreak/>
         <w:t>WORK EXPERIENCE CONTINUED</w:t>
@@ -807,7 +915,7 @@
     </w:p>
     <w:p>
       <w:pPr>
-        <w:spacing w:after="120"/>
+        <w:spacing w:after="120" w:line="360" w:lineRule="auto"/>
         <w:rPr>
           <w:rFonts w:ascii="Arial" w:eastAsia="Mulish" w:hAnsi="Arial" w:cs="Arial"/>
           <w:i/>
@@ -881,7 +989,7 @@
     </w:p>
     <w:p>
       <w:pPr>
-        <w:spacing w:after="120"/>
+        <w:spacing w:after="120" w:line="360" w:lineRule="auto"/>
         <w:rPr>
           <w:rFonts w:ascii="Arial" w:eastAsia="Mulish" w:hAnsi="Arial" w:cs="Arial"/>
           <w:sz w:val="18"/>
@@ -913,7 +1021,7 @@
           <w:ilvl w:val="0"/>
           <w:numId w:val="4"/>
         </w:numPr>
-        <w:spacing w:after="360" w:line="312" w:lineRule="auto"/>
+        <w:spacing w:after="360" w:line="360" w:lineRule="auto"/>
         <w:ind w:right="-15"/>
         <w:rPr>
           <w:rFonts w:ascii="Arial" w:eastAsia="Mulish" w:hAnsi="Arial" w:cs="Arial"/>
@@ -936,7 +1044,7 @@
           <w:ilvl w:val="0"/>
           <w:numId w:val="4"/>
         </w:numPr>
-        <w:spacing w:after="360" w:line="312" w:lineRule="auto"/>
+        <w:spacing w:after="360" w:line="360" w:lineRule="auto"/>
         <w:ind w:right="-15"/>
         <w:rPr>
           <w:rFonts w:ascii="Arial" w:eastAsia="Mulish" w:hAnsi="Arial" w:cs="Arial"/>
@@ -954,7 +1062,7 @@
     <w:p>
       <w:pPr>
         <w:widowControl w:val="0"/>
-        <w:spacing w:after="120" w:line="312" w:lineRule="auto"/>
+        <w:spacing w:after="120" w:line="360" w:lineRule="auto"/>
         <w:ind w:right="-15"/>
         <w:rPr>
           <w:rFonts w:ascii="Arial" w:eastAsia="Mulish" w:hAnsi="Arial" w:cs="Arial"/>
@@ -1012,7 +1120,7 @@
     <w:p>
       <w:pPr>
         <w:widowControl w:val="0"/>
-        <w:spacing w:after="120" w:line="312" w:lineRule="auto"/>
+        <w:spacing w:after="120" w:line="360" w:lineRule="auto"/>
         <w:ind w:right="-15"/>
         <w:rPr>
           <w:rFonts w:ascii="Arial" w:eastAsia="Mulish" w:hAnsi="Arial" w:cs="Arial"/>
@@ -1039,7 +1147,7 @@
           <w:ilvl w:val="0"/>
           <w:numId w:val="6"/>
         </w:numPr>
-        <w:spacing w:after="360" w:line="312" w:lineRule="auto"/>
+        <w:spacing w:after="360" w:line="360" w:lineRule="auto"/>
         <w:ind w:right="-15"/>
         <w:rPr>
           <w:rFonts w:ascii="Arial" w:eastAsia="Mulish" w:hAnsi="Arial" w:cs="Arial"/>
@@ -1063,7 +1171,7 @@
           <w:ilvl w:val="0"/>
           <w:numId w:val="6"/>
         </w:numPr>
-        <w:spacing w:after="360" w:line="312" w:lineRule="auto"/>
+        <w:spacing w:after="360" w:line="360" w:lineRule="auto"/>
         <w:ind w:right="-15"/>
         <w:rPr>
           <w:rFonts w:ascii="Arial" w:eastAsia="Mulish" w:hAnsi="Arial" w:cs="Arial"/>
@@ -1086,7 +1194,7 @@
           <w:ilvl w:val="0"/>
           <w:numId w:val="6"/>
         </w:numPr>
-        <w:spacing w:after="360" w:line="312" w:lineRule="auto"/>
+        <w:spacing w:after="360" w:line="360" w:lineRule="auto"/>
         <w:ind w:right="-15"/>
         <w:rPr>
           <w:rFonts w:ascii="Arial" w:eastAsia="Mulish" w:hAnsi="Arial" w:cs="Arial"/>
@@ -1104,7 +1212,7 @@
     <w:p>
       <w:pPr>
         <w:widowControl w:val="0"/>
-        <w:spacing w:after="120" w:line="312" w:lineRule="auto"/>
+        <w:spacing w:after="120" w:line="360" w:lineRule="auto"/>
         <w:ind w:right="-15"/>
         <w:rPr>
           <w:rFonts w:ascii="Arial" w:eastAsia="Mulish" w:hAnsi="Arial" w:cs="Arial"/>
@@ -1174,7 +1282,7 @@
     <w:p>
       <w:pPr>
         <w:widowControl w:val="0"/>
-        <w:spacing w:after="120" w:line="312" w:lineRule="auto"/>
+        <w:spacing w:after="120" w:line="360" w:lineRule="auto"/>
         <w:ind w:right="-15"/>
         <w:rPr>
           <w:rFonts w:ascii="Arial" w:eastAsia="Mulish" w:hAnsi="Arial" w:cs="Arial"/>
@@ -1201,7 +1309,7 @@
           <w:ilvl w:val="0"/>
           <w:numId w:val="5"/>
         </w:numPr>
-        <w:spacing w:after="360" w:line="312" w:lineRule="auto"/>
+        <w:spacing w:after="360" w:line="360" w:lineRule="auto"/>
         <w:ind w:right="-15"/>
         <w:rPr>
           <w:rFonts w:ascii="Arial" w:eastAsia="Mulish" w:hAnsi="Arial" w:cs="Arial"/>
@@ -1224,7 +1332,7 @@
           <w:ilvl w:val="0"/>
           <w:numId w:val="5"/>
         </w:numPr>
-        <w:spacing w:after="360" w:line="312" w:lineRule="auto"/>
+        <w:spacing w:after="360" w:line="360" w:lineRule="auto"/>
         <w:ind w:right="-15"/>
         <w:rPr>
           <w:rFonts w:ascii="Arial" w:eastAsia="Mulish" w:hAnsi="Arial" w:cs="Arial"/>
@@ -1242,7 +1350,7 @@
     <w:p>
       <w:pPr>
         <w:widowControl w:val="0"/>
-        <w:spacing w:after="120" w:line="312" w:lineRule="auto"/>
+        <w:spacing w:after="120" w:line="360" w:lineRule="auto"/>
         <w:ind w:right="-15"/>
         <w:rPr>
           <w:rFonts w:ascii="Arial" w:eastAsia="Mulish" w:hAnsi="Arial" w:cs="Arial"/>
@@ -1323,7 +1431,7 @@
     <w:p>
       <w:pPr>
         <w:widowControl w:val="0"/>
-        <w:spacing w:after="120" w:line="312" w:lineRule="auto"/>
+        <w:spacing w:after="120" w:line="360" w:lineRule="auto"/>
         <w:ind w:right="-15"/>
         <w:rPr>
           <w:rFonts w:ascii="Arial" w:eastAsia="Mulish" w:hAnsi="Arial" w:cs="Arial"/>
@@ -1350,7 +1458,7 @@
           <w:ilvl w:val="0"/>
           <w:numId w:val="5"/>
         </w:numPr>
-        <w:spacing w:after="360" w:line="312" w:lineRule="auto"/>
+        <w:spacing w:after="360" w:line="360" w:lineRule="auto"/>
         <w:ind w:right="-15"/>
         <w:rPr>
           <w:rFonts w:ascii="Arial" w:eastAsia="Mulish" w:hAnsi="Arial" w:cs="Arial"/>
@@ -1380,7 +1488,7 @@
           <w:ilvl w:val="0"/>
           <w:numId w:val="5"/>
         </w:numPr>
-        <w:spacing w:after="360" w:line="312" w:lineRule="auto"/>
+        <w:spacing w:after="360" w:line="360" w:lineRule="auto"/>
         <w:ind w:right="-15"/>
         <w:rPr>
           <w:rFonts w:ascii="Arial" w:eastAsia="Mulish" w:hAnsi="Arial" w:cs="Arial"/>
@@ -1415,20 +1523,9 @@
     </w:p>
     <w:p>
       <w:pPr>
-        <w:spacing w:before="600"/>
-        <w:rPr>
-          <w:rFonts w:ascii="Arial" w:eastAsia="Mulish" w:hAnsi="Arial" w:cs="Arial"/>
-          <w:color w:val="000000" w:themeColor="text1"/>
-          <w:sz w:val="12"/>
-          <w:szCs w:val="12"/>
-        </w:rPr>
-      </w:pPr>
-    </w:p>
-    <w:p>
-      <w:pPr>
         <w:widowControl w:val="0"/>
         <w:spacing w:after="120" w:line="312" w:lineRule="auto"/>
-        <w:ind w:left="720" w:right="-15"/>
+        <w:ind w:right="-15"/>
         <w:rPr>
           <w:rFonts w:ascii="Arial" w:eastAsia="Mulish" w:hAnsi="Arial" w:cs="Arial"/>
           <w:sz w:val="18"/>
@@ -1663,145 +1760,37 @@
 <file path=word/numbering.xml><?xml version="1.0" encoding="utf-8"?>
 <w:numbering xmlns:wpc="http://schemas.microsoft.com/office/word/2010/wordprocessingCanvas" xmlns:cx="http://schemas.microsoft.com/office/drawing/2014/chartex" xmlns:cx1="http://schemas.microsoft.com/office/drawing/2015/9/8/chartex" xmlns:cx2="http://schemas.microsoft.com/office/drawing/2015/10/21/chartex" xmlns:cx3="http://schemas.microsoft.com/office/drawing/2016/5/9/chartex" xmlns:cx4="http://schemas.microsoft.com/office/drawing/2016/5/10/chartex" xmlns:cx5="http://schemas.microsoft.com/office/drawing/2016/5/11/chartex" xmlns:cx6="http://schemas.microsoft.com/office/drawing/2016/5/12/chartex" xmlns:cx7="http://schemas.microsoft.com/office/drawing/2016/5/13/chartex" xmlns:cx8="http://schemas.microsoft.com/office/drawing/2016/5/14/chartex" xmlns:mc="http://schemas.openxmlformats.org/markup-compatibility/2006" xmlns:aink="http://schemas.microsoft.com/office/drawing/2016/ink" xmlns:am3d="http://schemas.microsoft.com/office/drawing/2017/model3d" xmlns:o="urn:schemas-microsoft-com:office:office" xmlns:oel="http://schemas.microsoft.com/office/2019/extlst" xmlns:r="http://schemas.openxmlformats.org/officeDocument/2006/relationships" xmlns:m="http://schemas.openxmlformats.org/officeDocument/2006/math" xmlns:v="urn:schemas-microsoft-com:vml" xmlns:wp14="http://schemas.microsoft.com/office/word/2010/wordprocessingDrawing" xmlns:wp="http://schemas.openxmlformats.org/drawingml/2006/wordprocessingDrawing" xmlns:w10="urn:schemas-microsoft-com:office:word" xmlns:w="http://schemas.openxmlformats.org/wordprocessingml/2006/main" xmlns:w14="http://schemas.microsoft.com/office/word/2010/wordml" xmlns:w15="http://schemas.microsoft.com/office/word/2012/wordml" xmlns:w16cex="http://schemas.microsoft.com/office/word/2018/wordml/cex" xmlns:w16cid="http://schemas.microsoft.com/office/word/2016/wordml/cid" xmlns:w16="http://schemas.microsoft.com/office/word/2018/wordml" xmlns:w16du="http://schemas.microsoft.com/office/word/2023/wordml/word16du" xmlns:w16sdtdh="http://schemas.microsoft.com/office/word/2020/wordml/sdtdatahash" xmlns:w16sdtfl="http://schemas.microsoft.com/office/word/2024/wordml/sdtformatlock" xmlns:w16se="http://schemas.microsoft.com/office/word/2015/wordml/symex" xmlns:wpg="http://schemas.microsoft.com/office/word/2010/wordprocessingGroup" xmlns:wpi="http://schemas.microsoft.com/office/word/2010/wordprocessingInk" xmlns:wne="http://schemas.microsoft.com/office/word/2006/wordml" xmlns:wps="http://schemas.microsoft.com/office/word/2010/wordprocessingShape" mc:Ignorable="w14 w15 w16se w16cid w16 w16cex w16sdtdh w16sdtfl w16du wp14">
   <w:numPicBullet w:numPicBulletId="0">
-    <mc:AlternateContent>
-      <mc:Choice Requires="v">
-        <w:pict>
-          <v:shapetype w14:anchorId="18BC8186" id="_x0000_t75" coordsize="21600,21600" o:spt="75" o:preferrelative="t" path="m@4@5l@4@11@9@11@9@5xe" filled="f" stroked="f">
-            <v:stroke joinstyle="miter"/>
-            <v:formulas>
-              <v:f eqn="if lineDrawn pixelLineWidth 0"/>
-              <v:f eqn="sum @0 1 0"/>
-              <v:f eqn="sum 0 0 @1"/>
-              <v:f eqn="prod @2 1 2"/>
-              <v:f eqn="prod @3 21600 pixelWidth"/>
-              <v:f eqn="prod @3 21600 pixelHeight"/>
-              <v:f eqn="sum @0 0 1"/>
-              <v:f eqn="prod @6 1 2"/>
-              <v:f eqn="prod @7 21600 pixelWidth"/>
-              <v:f eqn="sum @8 21600 0"/>
-              <v:f eqn="prod @7 21600 pixelHeight"/>
-              <v:f eqn="sum @10 21600 0"/>
-            </v:formulas>
-            <v:path o:extrusionok="f" gradientshapeok="t" o:connecttype="rect"/>
-            <o:lock v:ext="edit" aspectratio="t"/>
-          </v:shapetype>
-          <v:shape id="Picture 1761323937" o:spid="_x0000_i1025" type="#_x0000_t75" alt="A black background with a black square&#13;&#13;&#10;&#13;&#13;&#10;Description automatically generated with medium confidence" style="width:383pt;height:383pt;visibility:visible;mso-wrap-style:square">
-            <v:imagedata r:id="rId1" o:title="A black background with a black square&#13;&#13;&#10;&#13;&#13;&#10;Description automatically generated with medium confidence"/>
-          </v:shape>
-        </w:pict>
-      </mc:Choice>
-      <mc:Fallback>
-        <w:drawing>
-          <wp:inline distT="0" distB="0" distL="0" distR="0" wp14:anchorId="1B67B61E" wp14:editId="74C25C5C">
-            <wp:extent cx="4864100" cy="4864100"/>
-            <wp:effectExtent l="0" t="0" r="0" b="0"/>
-            <wp:docPr id="1761323937" name="Picture 1761323937" descr="A black background with a black square&#13;&#13;&#10;&#13;&#13;&#10;Description automatically generated with medium confidence"/>
-            <wp:cNvGraphicFramePr>
-              <a:graphicFrameLocks xmlns:a="http://schemas.openxmlformats.org/drawingml/2006/main" noChangeAspect="1"/>
-            </wp:cNvGraphicFramePr>
-            <a:graphic xmlns:a="http://schemas.openxmlformats.org/drawingml/2006/main">
-              <a:graphicData uri="http://schemas.openxmlformats.org/drawingml/2006/picture">
-                <pic:pic xmlns:pic="http://schemas.openxmlformats.org/drawingml/2006/picture">
-                  <pic:nvPicPr>
-                    <pic:cNvPr id="0" name="Picture -1023" descr="A black background with a black square&#13;&#13;&#10;&#13;&#13;&#10;Description automatically generated with medium confidence"/>
-                    <pic:cNvPicPr>
-                      <a:picLocks noChangeAspect="1" noChangeArrowheads="1"/>
-                    </pic:cNvPicPr>
-                  </pic:nvPicPr>
-                  <pic:blipFill>
-                    <a:blip r:embed="rId2">
-                      <a:extLst>
-                        <a:ext uri="{28A0092B-C50C-407E-A947-70E740481C1C}">
-                          <a14:useLocalDpi xmlns:a14="http://schemas.microsoft.com/office/drawing/2010/main" val="0"/>
-                        </a:ext>
-                      </a:extLst>
-                    </a:blip>
-                    <a:srcRect/>
-                    <a:stretch>
-                      <a:fillRect/>
-                    </a:stretch>
-                  </pic:blipFill>
-                  <pic:spPr bwMode="auto">
-                    <a:xfrm>
-                      <a:off x="0" y="0"/>
-                      <a:ext cx="4864100" cy="4864100"/>
-                    </a:xfrm>
-                    <a:prstGeom prst="rect">
-                      <a:avLst/>
-                    </a:prstGeom>
-                    <a:noFill/>
-                    <a:ln>
-                      <a:noFill/>
-                    </a:ln>
-                  </pic:spPr>
-                </pic:pic>
-              </a:graphicData>
-            </a:graphic>
-          </wp:inline>
-        </w:drawing>
-      </mc:Fallback>
-    </mc:AlternateContent>
+    <w:pict>
+      <v:shapetype id="_x0000_t75" coordsize="21600,21600" o:spt="75" o:preferrelative="t" path="m@4@5l@4@11@9@11@9@5xe" filled="f" stroked="f">
+        <v:stroke joinstyle="miter"/>
+        <v:formulas>
+          <v:f eqn="if lineDrawn pixelLineWidth 0"/>
+          <v:f eqn="sum @0 1 0"/>
+          <v:f eqn="sum 0 0 @1"/>
+          <v:f eqn="prod @2 1 2"/>
+          <v:f eqn="prod @3 21600 pixelWidth"/>
+          <v:f eqn="prod @3 21600 pixelHeight"/>
+          <v:f eqn="sum @0 0 1"/>
+          <v:f eqn="prod @6 1 2"/>
+          <v:f eqn="prod @7 21600 pixelWidth"/>
+          <v:f eqn="sum @8 21600 0"/>
+          <v:f eqn="prod @7 21600 pixelHeight"/>
+          <v:f eqn="sum @10 21600 0"/>
+        </v:formulas>
+        <v:path o:extrusionok="f" gradientshapeok="t" o:connecttype="rect"/>
+        <o:lock v:ext="edit" aspectratio="t"/>
+      </v:shapetype>
+      <v:shape id="_x0000_i1073" type="#_x0000_t75" alt="A black background with a black square&#13;&#13;&#13;&#10;&#13;&#13;&#13;&#10;Description automatically generated with medium confidence" style="width:382.95pt;height:382.95pt;visibility:visible;mso-wrap-style:square" o:bullet="t">
+        <v:imagedata r:id="rId1" o:title="A black background with a black square&#13;&#13;&#13;&#10;&#13;&#13;&#13;&#10;Description automatically generated with medium confidence"/>
+      </v:shape>
+    </w:pict>
   </w:numPicBullet>
   <w:numPicBullet w:numPicBulletId="1">
-    <mc:AlternateContent>
-      <mc:Choice Requires="v">
-        <w:pict>
-          <v:shape w14:anchorId="5EBC296E" id="Picture 558421598" o:spid="_x0000_i1025" type="#_x0000_t75" alt="A black background with a black square&#13;&#13;&#10;&#13;&#13;&#10;Description automatically generated with medium confidence" style="width:383pt;height:383pt;visibility:visible;mso-wrap-style:square">
-            <v:imagedata r:id="rId3" o:title="A black background with a black square&#13;&#13;&#10;&#13;&#13;&#10;Description automatically generated with medium confidence"/>
-          </v:shape>
-        </w:pict>
-      </mc:Choice>
-      <mc:Fallback>
-        <w:drawing>
-          <wp:inline distT="0" distB="0" distL="0" distR="0" wp14:anchorId="5F5E2FDA" wp14:editId="3B5EB6C1">
-            <wp:extent cx="4864100" cy="4864100"/>
-            <wp:effectExtent l="0" t="0" r="0" b="0"/>
-            <wp:docPr id="558421598" name="Picture 558421598" descr="A black background with a black square&#13;&#13;&#10;&#13;&#13;&#10;Description automatically generated with medium confidence"/>
-            <wp:cNvGraphicFramePr>
-              <a:graphicFrameLocks xmlns:a="http://schemas.openxmlformats.org/drawingml/2006/main" noChangeAspect="1"/>
-            </wp:cNvGraphicFramePr>
-            <a:graphic xmlns:a="http://schemas.openxmlformats.org/drawingml/2006/main">
-              <a:graphicData uri="http://schemas.openxmlformats.org/drawingml/2006/picture">
-                <pic:pic xmlns:pic="http://schemas.openxmlformats.org/drawingml/2006/picture">
-                  <pic:nvPicPr>
-                    <pic:cNvPr id="0" name="Picture -1022" descr="A black background with a black square&#13;&#13;&#10;&#13;&#13;&#10;Description automatically generated with medium confidence"/>
-                    <pic:cNvPicPr>
-                      <a:picLocks noChangeAspect="1" noChangeArrowheads="1"/>
-                    </pic:cNvPicPr>
-                  </pic:nvPicPr>
-                  <pic:blipFill>
-                    <a:blip r:embed="rId4">
-                      <a:extLst>
-                        <a:ext uri="{28A0092B-C50C-407E-A947-70E740481C1C}">
-                          <a14:useLocalDpi xmlns:a14="http://schemas.microsoft.com/office/drawing/2010/main" val="0"/>
-                        </a:ext>
-                      </a:extLst>
-                    </a:blip>
-                    <a:srcRect/>
-                    <a:stretch>
-                      <a:fillRect/>
-                    </a:stretch>
-                  </pic:blipFill>
-                  <pic:spPr bwMode="auto">
-                    <a:xfrm>
-                      <a:off x="0" y="0"/>
-                      <a:ext cx="4864100" cy="4864100"/>
-                    </a:xfrm>
-                    <a:prstGeom prst="rect">
-                      <a:avLst/>
-                    </a:prstGeom>
-                    <a:noFill/>
-                    <a:ln>
-                      <a:noFill/>
-                    </a:ln>
-                  </pic:spPr>
-                </pic:pic>
-              </a:graphicData>
-            </a:graphic>
-          </wp:inline>
-        </w:drawing>
-      </mc:Fallback>
-    </mc:AlternateContent>
+    <w:pict>
+      <v:shape id="_x0000_i1074" type="#_x0000_t75" alt="A black background with a black square&#13;&#13;&#13;&#10;&#13;&#13;&#13;&#10;Description automatically generated with medium confidence" style="width:382.95pt;height:382.95pt;visibility:visible;mso-wrap-style:square" o:bullet="t">
+        <v:imagedata r:id="rId2" o:title="A black background with a black square&#13;&#13;&#13;&#10;&#13;&#13;&#13;&#10;Description automatically generated with medium confidence"/>
+      </v:shape>
+    </w:pict>
   </w:numPicBullet>
   <w:abstractNum w:abstractNumId="0" w15:restartNumberingAfterBreak="0">
     <w:nsid w:val="09066A8F"/>

</xml_diff>